<commit_message>
Gaze Unconstrained + new button
</commit_message>
<xml_diff>
--- a/Notizen.docx
+++ b/Notizen.docx
@@ -506,6 +506,57 @@
       <w:pPr>
         <w:pStyle w:val="Listenabsatz"/>
         <w:numPr>
+          <w:ilvl w:val="0"/>
+          <w:numId w:val="12"/>
+        </w:numPr>
+      </w:pPr>
+      <w:r>
+        <w:t>Wie Modelle anhand Datensätze e</w:t>
+      </w:r>
+      <w:r>
+        <w:t>valuiert werden</w:t>
+      </w:r>
+    </w:p>
+    <w:p>
+      <w:pPr>
+        <w:pStyle w:val="Listenabsatz"/>
+        <w:numPr>
+          <w:ilvl w:val="0"/>
+          <w:numId w:val="12"/>
+        </w:numPr>
+        <w:rPr>
+          <w:lang w:val="en-US"/>
+        </w:rPr>
+      </w:pPr>
+      <w:r>
+        <w:rPr>
+          <w:lang w:val="en-US"/>
+        </w:rPr>
+        <w:t>Cross-dataset</w:t>
+      </w:r>
+      <w:r>
+        <w:rPr>
+          <w:lang w:val="en-US"/>
+        </w:rPr>
+        <w:t>,</w:t>
+      </w:r>
+      <w:r>
+        <w:rPr>
+          <w:lang w:val="en-US"/>
+        </w:rPr>
+        <w:t xml:space="preserve"> Within-dataset u</w:t>
+      </w:r>
+      <w:r>
+        <w:rPr>
+          <w:lang w:val="en-US"/>
+        </w:rPr>
+        <w:t>nd Person-specific</w:t>
+      </w:r>
+    </w:p>
+    <w:p>
+      <w:pPr>
+        <w:pStyle w:val="Listenabsatz"/>
+        <w:numPr>
           <w:ilvl w:val="1"/>
           <w:numId w:val="3"/>
         </w:numPr>
@@ -811,20 +862,84 @@
         <w:t>Das bestehende Model basiert auf L2CS-Net.</w:t>
       </w:r>
     </w:p>
-    <w:p>
-      <w:r>
-        <w:t xml:space="preserve">Bei Gaze </w:t>
+    <w:p/>
+    <w:p>
+      <w:r>
+        <w:t>Zum Vergleich werden einige wichtige Datensätze</w:t>
+      </w:r>
+      <w:r>
+        <w:t xml:space="preserve"> angeschaut. (</w:t>
       </w:r>
       <w:proofErr w:type="spellStart"/>
       <w:r>
+        <w:t>MPIIGaze</w:t>
+      </w:r>
+      <w:proofErr w:type="spellEnd"/>
+      <w:r>
+        <w:t>, Gaze360, ETH-</w:t>
+      </w:r>
+      <w:proofErr w:type="spellStart"/>
+      <w:r>
+        <w:t>XGaze</w:t>
+      </w:r>
+      <w:proofErr w:type="spellEnd"/>
+      <w:r>
+        <w:t>)</w:t>
+      </w:r>
+    </w:p>
+    <w:p/>
+    <w:p>
+      <w:r>
+        <w:t>Das Programm</w:t>
+      </w:r>
+      <w:r>
+        <w:t xml:space="preserve"> zeigt jeweils einen Marker in Form von kleine</w:t>
+      </w:r>
+      <w:r>
+        <w:t>n</w:t>
+      </w:r>
+      <w:r>
+        <w:t xml:space="preserve"> rote</w:t>
+      </w:r>
+      <w:r>
+        <w:t>n</w:t>
+      </w:r>
+      <w:r>
+        <w:t xml:space="preserve"> Punkten mit zufälliger Position auf dem Bildschirm. Ein immer kleiner werdender Kreis um den Marker stellt einen Fortschritt dar, wann der Nutzer eine Interaktion ausführen soll. Sobald der Kreis am kleinsten ist, ändert sich die Farbe des Markers von rot auf grün und der Nutzer hat 500ms Zeit auf die Leertaste zu drücken.</w:t>
+      </w:r>
+    </w:p>
+    <w:p>
+      <w:r>
+        <w:t>Im Moment werden 20 Marker getestet und die Positionen und Reaktionszeit pro Marker werden gespeichert.</w:t>
+      </w:r>
+    </w:p>
+    <w:p/>
+    <w:p>
+      <w:r>
+        <w:br w:type="page"/>
+      </w:r>
+    </w:p>
+    <w:p>
+      <w:r>
+        <w:lastRenderedPageBreak/>
+        <w:t>Die</w:t>
+      </w:r>
+      <w:r>
+        <w:t xml:space="preserve"> Gaze </w:t>
+      </w:r>
+      <w:proofErr w:type="spellStart"/>
+      <w:r>
         <w:t>Estimation</w:t>
       </w:r>
       <w:proofErr w:type="spellEnd"/>
       <w:r>
-        <w:t xml:space="preserve"> (Blickeinschätzung) ist generell zwischen </w:t>
-      </w:r>
-      <w:r>
-        <w:t>model</w:t>
+        <w:t xml:space="preserve"> (Blickeinschätzung)</w:t>
+      </w:r>
+      <w:r>
+        <w:t xml:space="preserve"> wird im allgemeinen</w:t>
+      </w:r>
+      <w:r>
+        <w:t xml:space="preserve"> zwischen model</w:t>
       </w:r>
       <w:r>
         <w:t>-</w:t>
@@ -843,50 +958,18 @@
       </w:r>
       <w:proofErr w:type="spellEnd"/>
       <w:r>
-        <w:t xml:space="preserve"> zu unterscheiden.</w:t>
-      </w:r>
-    </w:p>
-    <w:p/>
-    <w:p>
-      <w:r>
-        <w:t>Zum Vergleich werden einige wichtige Datensätze</w:t>
-      </w:r>
-      <w:r>
-        <w:t xml:space="preserve"> angeschaut. (</w:t>
-      </w:r>
-      <w:proofErr w:type="spellStart"/>
-      <w:r>
-        <w:t>MPIIGaze</w:t>
-      </w:r>
-      <w:proofErr w:type="spellEnd"/>
-      <w:r>
-        <w:t>, Gaze360, ETH-</w:t>
-      </w:r>
-      <w:proofErr w:type="spellStart"/>
-      <w:r>
-        <w:t>XGaze</w:t>
-      </w:r>
-      <w:proofErr w:type="spellEnd"/>
-      <w:r>
-        <w:t>)</w:t>
-      </w:r>
-    </w:p>
-    <w:p/>
-    <w:p>
-      <w:r>
-        <w:t>Das Programm</w:t>
-      </w:r>
-      <w:r>
-        <w:t xml:space="preserve"> zeigt jeweils einen Marker in Form von kleinem rotem Punkten mit zufälliger Position auf dem Bildschirm. Ein immer kleiner werdender Kreis um den Marker stellt einen Fortschritt dar, wann der Nutzer eine Interaktion ausführen soll. Sobald der Kreis am kleinsten ist, ändert sich die Farbe des Markers von rot auf grün und der Nutzer hat 500ms Zeit auf die Leertaste zu drücken.</w:t>
-      </w:r>
-    </w:p>
-    <w:p>
-      <w:r>
-        <w:t>Im Moment werden 20 Marker getestet und die Positionen und Reaktionszeit pro Marker werden gespeichert.</w:t>
-      </w:r>
-    </w:p>
-    <w:p/>
-    <w:p/>
+        <w:t xml:space="preserve"> untersch</w:t>
+      </w:r>
+      <w:r>
+        <w:t>ie</w:t>
+      </w:r>
+      <w:r>
+        <w:t>den.</w:t>
+      </w:r>
+      <w:r>
+        <w:t xml:space="preserve"> </w:t>
+      </w:r>
+    </w:p>
     <w:sectPr>
       <w:footerReference w:type="even" r:id="rId7"/>
       <w:footerReference w:type="default" r:id="rId8"/>
@@ -1631,6 +1714,119 @@
     </w:lvl>
   </w:abstractNum>
   <w:abstractNum w:abstractNumId="6" w15:restartNumberingAfterBreak="0">
+    <w:nsid w:val="37143FA5"/>
+    <w:multiLevelType w:val="hybridMultilevel"/>
+    <w:tmpl w:val="BC8A7D5C"/>
+    <w:lvl w:ilvl="0" w:tplc="04070001">
+      <w:start w:val="1"/>
+      <w:numFmt w:val="bullet"/>
+      <w:lvlText w:val=""/>
+      <w:lvlJc w:val="left"/>
+      <w:pPr>
+        <w:ind w:left="1438" w:hanging="360"/>
+      </w:pPr>
+      <w:rPr>
+        <w:rFonts w:ascii="Symbol" w:hAnsi="Symbol" w:hint="default"/>
+      </w:rPr>
+    </w:lvl>
+    <w:lvl w:ilvl="1" w:tplc="04070003" w:tentative="1">
+      <w:start w:val="1"/>
+      <w:numFmt w:val="bullet"/>
+      <w:lvlText w:val="o"/>
+      <w:lvlJc w:val="left"/>
+      <w:pPr>
+        <w:ind w:left="2158" w:hanging="360"/>
+      </w:pPr>
+      <w:rPr>
+        <w:rFonts w:ascii="Courier New" w:hAnsi="Courier New" w:cs="Courier New" w:hint="default"/>
+      </w:rPr>
+    </w:lvl>
+    <w:lvl w:ilvl="2" w:tplc="04070005" w:tentative="1">
+      <w:start w:val="1"/>
+      <w:numFmt w:val="bullet"/>
+      <w:lvlText w:val=""/>
+      <w:lvlJc w:val="left"/>
+      <w:pPr>
+        <w:ind w:left="2878" w:hanging="360"/>
+      </w:pPr>
+      <w:rPr>
+        <w:rFonts w:ascii="Wingdings" w:hAnsi="Wingdings" w:hint="default"/>
+      </w:rPr>
+    </w:lvl>
+    <w:lvl w:ilvl="3" w:tplc="04070001" w:tentative="1">
+      <w:start w:val="1"/>
+      <w:numFmt w:val="bullet"/>
+      <w:lvlText w:val=""/>
+      <w:lvlJc w:val="left"/>
+      <w:pPr>
+        <w:ind w:left="3598" w:hanging="360"/>
+      </w:pPr>
+      <w:rPr>
+        <w:rFonts w:ascii="Symbol" w:hAnsi="Symbol" w:hint="default"/>
+      </w:rPr>
+    </w:lvl>
+    <w:lvl w:ilvl="4" w:tplc="04070003" w:tentative="1">
+      <w:start w:val="1"/>
+      <w:numFmt w:val="bullet"/>
+      <w:lvlText w:val="o"/>
+      <w:lvlJc w:val="left"/>
+      <w:pPr>
+        <w:ind w:left="4318" w:hanging="360"/>
+      </w:pPr>
+      <w:rPr>
+        <w:rFonts w:ascii="Courier New" w:hAnsi="Courier New" w:cs="Courier New" w:hint="default"/>
+      </w:rPr>
+    </w:lvl>
+    <w:lvl w:ilvl="5" w:tplc="04070005" w:tentative="1">
+      <w:start w:val="1"/>
+      <w:numFmt w:val="bullet"/>
+      <w:lvlText w:val=""/>
+      <w:lvlJc w:val="left"/>
+      <w:pPr>
+        <w:ind w:left="5038" w:hanging="360"/>
+      </w:pPr>
+      <w:rPr>
+        <w:rFonts w:ascii="Wingdings" w:hAnsi="Wingdings" w:hint="default"/>
+      </w:rPr>
+    </w:lvl>
+    <w:lvl w:ilvl="6" w:tplc="04070001" w:tentative="1">
+      <w:start w:val="1"/>
+      <w:numFmt w:val="bullet"/>
+      <w:lvlText w:val=""/>
+      <w:lvlJc w:val="left"/>
+      <w:pPr>
+        <w:ind w:left="5758" w:hanging="360"/>
+      </w:pPr>
+      <w:rPr>
+        <w:rFonts w:ascii="Symbol" w:hAnsi="Symbol" w:hint="default"/>
+      </w:rPr>
+    </w:lvl>
+    <w:lvl w:ilvl="7" w:tplc="04070003" w:tentative="1">
+      <w:start w:val="1"/>
+      <w:numFmt w:val="bullet"/>
+      <w:lvlText w:val="o"/>
+      <w:lvlJc w:val="left"/>
+      <w:pPr>
+        <w:ind w:left="6478" w:hanging="360"/>
+      </w:pPr>
+      <w:rPr>
+        <w:rFonts w:ascii="Courier New" w:hAnsi="Courier New" w:cs="Courier New" w:hint="default"/>
+      </w:rPr>
+    </w:lvl>
+    <w:lvl w:ilvl="8" w:tplc="04070005" w:tentative="1">
+      <w:start w:val="1"/>
+      <w:numFmt w:val="bullet"/>
+      <w:lvlText w:val=""/>
+      <w:lvlJc w:val="left"/>
+      <w:pPr>
+        <w:ind w:left="7198" w:hanging="360"/>
+      </w:pPr>
+      <w:rPr>
+        <w:rFonts w:ascii="Wingdings" w:hAnsi="Wingdings" w:hint="default"/>
+      </w:rPr>
+    </w:lvl>
+  </w:abstractNum>
+  <w:abstractNum w:abstractNumId="7" w15:restartNumberingAfterBreak="0">
     <w:nsid w:val="53814972"/>
     <w:multiLevelType w:val="multilevel"/>
     <w:tmpl w:val="7D7A5916"/>
@@ -1750,7 +1946,7 @@
       </w:rPr>
     </w:lvl>
   </w:abstractNum>
-  <w:abstractNum w:abstractNumId="7" w15:restartNumberingAfterBreak="0">
+  <w:abstractNum w:abstractNumId="8" w15:restartNumberingAfterBreak="0">
     <w:nsid w:val="5AE67A23"/>
     <w:multiLevelType w:val="multilevel"/>
     <w:tmpl w:val="90767538"/>
@@ -1870,7 +2066,7 @@
       </w:rPr>
     </w:lvl>
   </w:abstractNum>
-  <w:abstractNum w:abstractNumId="8" w15:restartNumberingAfterBreak="0">
+  <w:abstractNum w:abstractNumId="9" w15:restartNumberingAfterBreak="0">
     <w:nsid w:val="5E1A633F"/>
     <w:multiLevelType w:val="multilevel"/>
     <w:tmpl w:val="ADDC55AA"/>
@@ -1991,7 +2187,120 @@
       </w:rPr>
     </w:lvl>
   </w:abstractNum>
-  <w:abstractNum w:abstractNumId="9" w15:restartNumberingAfterBreak="0">
+  <w:abstractNum w:abstractNumId="10" w15:restartNumberingAfterBreak="0">
+    <w:nsid w:val="62E41D00"/>
+    <w:multiLevelType w:val="hybridMultilevel"/>
+    <w:tmpl w:val="A1F23F5C"/>
+    <w:lvl w:ilvl="0" w:tplc="04070001">
+      <w:start w:val="1"/>
+      <w:numFmt w:val="bullet"/>
+      <w:lvlText w:val=""/>
+      <w:lvlJc w:val="left"/>
+      <w:pPr>
+        <w:ind w:left="1798" w:hanging="360"/>
+      </w:pPr>
+      <w:rPr>
+        <w:rFonts w:ascii="Symbol" w:hAnsi="Symbol" w:hint="default"/>
+      </w:rPr>
+    </w:lvl>
+    <w:lvl w:ilvl="1" w:tplc="04070003" w:tentative="1">
+      <w:start w:val="1"/>
+      <w:numFmt w:val="bullet"/>
+      <w:lvlText w:val="o"/>
+      <w:lvlJc w:val="left"/>
+      <w:pPr>
+        <w:ind w:left="2518" w:hanging="360"/>
+      </w:pPr>
+      <w:rPr>
+        <w:rFonts w:ascii="Courier New" w:hAnsi="Courier New" w:cs="Courier New" w:hint="default"/>
+      </w:rPr>
+    </w:lvl>
+    <w:lvl w:ilvl="2" w:tplc="04070005" w:tentative="1">
+      <w:start w:val="1"/>
+      <w:numFmt w:val="bullet"/>
+      <w:lvlText w:val=""/>
+      <w:lvlJc w:val="left"/>
+      <w:pPr>
+        <w:ind w:left="3238" w:hanging="360"/>
+      </w:pPr>
+      <w:rPr>
+        <w:rFonts w:ascii="Wingdings" w:hAnsi="Wingdings" w:hint="default"/>
+      </w:rPr>
+    </w:lvl>
+    <w:lvl w:ilvl="3" w:tplc="04070001" w:tentative="1">
+      <w:start w:val="1"/>
+      <w:numFmt w:val="bullet"/>
+      <w:lvlText w:val=""/>
+      <w:lvlJc w:val="left"/>
+      <w:pPr>
+        <w:ind w:left="3958" w:hanging="360"/>
+      </w:pPr>
+      <w:rPr>
+        <w:rFonts w:ascii="Symbol" w:hAnsi="Symbol" w:hint="default"/>
+      </w:rPr>
+    </w:lvl>
+    <w:lvl w:ilvl="4" w:tplc="04070003" w:tentative="1">
+      <w:start w:val="1"/>
+      <w:numFmt w:val="bullet"/>
+      <w:lvlText w:val="o"/>
+      <w:lvlJc w:val="left"/>
+      <w:pPr>
+        <w:ind w:left="4678" w:hanging="360"/>
+      </w:pPr>
+      <w:rPr>
+        <w:rFonts w:ascii="Courier New" w:hAnsi="Courier New" w:cs="Courier New" w:hint="default"/>
+      </w:rPr>
+    </w:lvl>
+    <w:lvl w:ilvl="5" w:tplc="04070005" w:tentative="1">
+      <w:start w:val="1"/>
+      <w:numFmt w:val="bullet"/>
+      <w:lvlText w:val=""/>
+      <w:lvlJc w:val="left"/>
+      <w:pPr>
+        <w:ind w:left="5398" w:hanging="360"/>
+      </w:pPr>
+      <w:rPr>
+        <w:rFonts w:ascii="Wingdings" w:hAnsi="Wingdings" w:hint="default"/>
+      </w:rPr>
+    </w:lvl>
+    <w:lvl w:ilvl="6" w:tplc="04070001" w:tentative="1">
+      <w:start w:val="1"/>
+      <w:numFmt w:val="bullet"/>
+      <w:lvlText w:val=""/>
+      <w:lvlJc w:val="left"/>
+      <w:pPr>
+        <w:ind w:left="6118" w:hanging="360"/>
+      </w:pPr>
+      <w:rPr>
+        <w:rFonts w:ascii="Symbol" w:hAnsi="Symbol" w:hint="default"/>
+      </w:rPr>
+    </w:lvl>
+    <w:lvl w:ilvl="7" w:tplc="04070003" w:tentative="1">
+      <w:start w:val="1"/>
+      <w:numFmt w:val="bullet"/>
+      <w:lvlText w:val="o"/>
+      <w:lvlJc w:val="left"/>
+      <w:pPr>
+        <w:ind w:left="6838" w:hanging="360"/>
+      </w:pPr>
+      <w:rPr>
+        <w:rFonts w:ascii="Courier New" w:hAnsi="Courier New" w:cs="Courier New" w:hint="default"/>
+      </w:rPr>
+    </w:lvl>
+    <w:lvl w:ilvl="8" w:tplc="04070005" w:tentative="1">
+      <w:start w:val="1"/>
+      <w:numFmt w:val="bullet"/>
+      <w:lvlText w:val=""/>
+      <w:lvlJc w:val="left"/>
+      <w:pPr>
+        <w:ind w:left="7558" w:hanging="360"/>
+      </w:pPr>
+      <w:rPr>
+        <w:rFonts w:ascii="Wingdings" w:hAnsi="Wingdings" w:hint="default"/>
+      </w:rPr>
+    </w:lvl>
+  </w:abstractNum>
+  <w:abstractNum w:abstractNumId="11" w15:restartNumberingAfterBreak="0">
     <w:nsid w:val="73C8170F"/>
     <w:multiLevelType w:val="multilevel"/>
     <w:tmpl w:val="90767538"/>
@@ -2118,13 +2427,13 @@
     <w:abstractNumId w:val="5"/>
   </w:num>
   <w:num w:numId="3" w16cid:durableId="1432319059">
+    <w:abstractNumId w:val="9"/>
+  </w:num>
+  <w:num w:numId="4" w16cid:durableId="1846286959">
     <w:abstractNumId w:val="8"/>
   </w:num>
-  <w:num w:numId="4" w16cid:durableId="1846286959">
-    <w:abstractNumId w:val="7"/>
-  </w:num>
   <w:num w:numId="5" w16cid:durableId="1607738500">
-    <w:abstractNumId w:val="9"/>
+    <w:abstractNumId w:val="11"/>
   </w:num>
   <w:num w:numId="6" w16cid:durableId="1357655594">
     <w:abstractNumId w:val="3"/>
@@ -2139,6 +2448,12 @@
     <w:abstractNumId w:val="2"/>
   </w:num>
   <w:num w:numId="10" w16cid:durableId="1876968170">
+    <w:abstractNumId w:val="7"/>
+  </w:num>
+  <w:num w:numId="11" w16cid:durableId="18513663">
+    <w:abstractNumId w:val="10"/>
+  </w:num>
+  <w:num w:numId="12" w16cid:durableId="1121339244">
     <w:abstractNumId w:val="6"/>
   </w:num>
 </w:numbering>

</xml_diff>